<commit_message>
Hice planilla de trazo medio de Nuevo Retiro, Registrar Actividad y ayude con los objetivos de los casos
</commit_message>
<xml_diff>
--- a/Logs de cada Rama.docx
+++ b/Logs de cada Rama.docx
@@ -78,51 +78,6 @@
           <w:lang w:val="es-AR"/>
         </w:rPr>
       </w:pPr>
-      <w:r>
-        <w:rPr>
-          <w:b/>
-          <w:bCs/>
-          <w:noProof/>
-          <w:sz w:val="24"/>
-          <w:szCs w:val="24"/>
-          <w:lang w:val="es-AR"/>
-        </w:rPr>
-        <w:drawing>
-          <wp:inline distT="0" distB="0" distL="0" distR="0" wp14:anchorId="5F62153D" wp14:editId="41039C51">
-            <wp:extent cx="5612130" cy="1562735"/>
-            <wp:effectExtent l="0" t="0" r="7620" b="0"/>
-            <wp:docPr id="6" name="Imagen 6"/>
-            <wp:cNvGraphicFramePr>
-              <a:graphicFrameLocks xmlns:a="http://schemas.openxmlformats.org/drawingml/2006/main" noChangeAspect="1"/>
-            </wp:cNvGraphicFramePr>
-            <a:graphic xmlns:a="http://schemas.openxmlformats.org/drawingml/2006/main">
-              <a:graphicData uri="http://schemas.openxmlformats.org/drawingml/2006/picture">
-                <pic:pic xmlns:pic="http://schemas.openxmlformats.org/drawingml/2006/picture">
-                  <pic:nvPicPr>
-                    <pic:cNvPr id="1" name=""/>
-                    <pic:cNvPicPr/>
-                  </pic:nvPicPr>
-                  <pic:blipFill>
-                    <a:blip r:embed="rId4"/>
-                    <a:stretch>
-                      <a:fillRect/>
-                    </a:stretch>
-                  </pic:blipFill>
-                  <pic:spPr>
-                    <a:xfrm>
-                      <a:off x="0" y="0"/>
-                      <a:ext cx="5612130" cy="1562735"/>
-                    </a:xfrm>
-                    <a:prstGeom prst="rect">
-                      <a:avLst/>
-                    </a:prstGeom>
-                  </pic:spPr>
-                </pic:pic>
-              </a:graphicData>
-            </a:graphic>
-          </wp:inline>
-        </w:drawing>
-      </w:r>
     </w:p>
     <w:p>
       <w:pPr>
@@ -147,7 +102,6 @@
     </w:p>
     <w:p>
       <w:pPr>
-        <w:jc w:val="center"/>
         <w:rPr>
           <w:b/>
           <w:bCs/>
@@ -156,51 +110,6 @@
           <w:lang w:val="es-AR"/>
         </w:rPr>
       </w:pPr>
-      <w:r>
-        <w:rPr>
-          <w:b/>
-          <w:bCs/>
-          <w:noProof/>
-          <w:sz w:val="40"/>
-          <w:szCs w:val="40"/>
-          <w:lang w:val="es-AR"/>
-        </w:rPr>
-        <w:drawing>
-          <wp:inline distT="0" distB="0" distL="0" distR="0" wp14:anchorId="1F1D439D" wp14:editId="73D867FC">
-            <wp:extent cx="5612130" cy="636270"/>
-            <wp:effectExtent l="0" t="0" r="7620" b="0"/>
-            <wp:docPr id="1" name="Imagen 1"/>
-            <wp:cNvGraphicFramePr>
-              <a:graphicFrameLocks xmlns:a="http://schemas.openxmlformats.org/drawingml/2006/main" noChangeAspect="1"/>
-            </wp:cNvGraphicFramePr>
-            <a:graphic xmlns:a="http://schemas.openxmlformats.org/drawingml/2006/main">
-              <a:graphicData uri="http://schemas.openxmlformats.org/drawingml/2006/picture">
-                <pic:pic xmlns:pic="http://schemas.openxmlformats.org/drawingml/2006/picture">
-                  <pic:nvPicPr>
-                    <pic:cNvPr id="1" name=""/>
-                    <pic:cNvPicPr/>
-                  </pic:nvPicPr>
-                  <pic:blipFill>
-                    <a:blip r:embed="rId5"/>
-                    <a:stretch>
-                      <a:fillRect/>
-                    </a:stretch>
-                  </pic:blipFill>
-                  <pic:spPr>
-                    <a:xfrm>
-                      <a:off x="0" y="0"/>
-                      <a:ext cx="5612130" cy="636270"/>
-                    </a:xfrm>
-                    <a:prstGeom prst="rect">
-                      <a:avLst/>
-                    </a:prstGeom>
-                  </pic:spPr>
-                </pic:pic>
-              </a:graphicData>
-            </a:graphic>
-          </wp:inline>
-        </w:drawing>
-      </w:r>
     </w:p>
     <w:p>
       <w:pPr>
@@ -255,50 +164,6 @@
           <w:lang w:val="es-AR"/>
         </w:rPr>
       </w:pPr>
-      <w:r>
-        <w:rPr>
-          <w:b/>
-          <w:bCs/>
-          <w:sz w:val="24"/>
-          <w:szCs w:val="24"/>
-          <w:lang w:val="es-AR"/>
-        </w:rPr>
-        <w:drawing>
-          <wp:inline distT="0" distB="0" distL="0" distR="0" wp14:anchorId="19A7A30C" wp14:editId="616A2CDB">
-            <wp:extent cx="5612130" cy="724535"/>
-            <wp:effectExtent l="0" t="0" r="7620" b="0"/>
-            <wp:docPr id="8" name="Imagen 8"/>
-            <wp:cNvGraphicFramePr>
-              <a:graphicFrameLocks xmlns:a="http://schemas.openxmlformats.org/drawingml/2006/main" noChangeAspect="1"/>
-            </wp:cNvGraphicFramePr>
-            <a:graphic xmlns:a="http://schemas.openxmlformats.org/drawingml/2006/main">
-              <a:graphicData uri="http://schemas.openxmlformats.org/drawingml/2006/picture">
-                <pic:pic xmlns:pic="http://schemas.openxmlformats.org/drawingml/2006/picture">
-                  <pic:nvPicPr>
-                    <pic:cNvPr id="1" name=""/>
-                    <pic:cNvPicPr/>
-                  </pic:nvPicPr>
-                  <pic:blipFill>
-                    <a:blip r:embed="rId6"/>
-                    <a:stretch>
-                      <a:fillRect/>
-                    </a:stretch>
-                  </pic:blipFill>
-                  <pic:spPr>
-                    <a:xfrm>
-                      <a:off x="0" y="0"/>
-                      <a:ext cx="5612130" cy="724535"/>
-                    </a:xfrm>
-                    <a:prstGeom prst="rect">
-                      <a:avLst/>
-                    </a:prstGeom>
-                  </pic:spPr>
-                </pic:pic>
-              </a:graphicData>
-            </a:graphic>
-          </wp:inline>
-        </w:drawing>
-      </w:r>
     </w:p>
     <w:p>
       <w:pPr>
@@ -341,51 +206,6 @@
           <w:lang w:val="es-AR"/>
         </w:rPr>
       </w:pPr>
-      <w:r>
-        <w:rPr>
-          <w:b/>
-          <w:bCs/>
-          <w:noProof/>
-          <w:sz w:val="24"/>
-          <w:szCs w:val="24"/>
-          <w:lang w:val="es-AR"/>
-        </w:rPr>
-        <w:drawing>
-          <wp:inline distT="0" distB="0" distL="0" distR="0" wp14:anchorId="3C21BE83" wp14:editId="4044CD41">
-            <wp:extent cx="5612130" cy="844550"/>
-            <wp:effectExtent l="0" t="0" r="7620" b="0"/>
-            <wp:docPr id="2" name="Imagen 2"/>
-            <wp:cNvGraphicFramePr>
-              <a:graphicFrameLocks xmlns:a="http://schemas.openxmlformats.org/drawingml/2006/main" noChangeAspect="1"/>
-            </wp:cNvGraphicFramePr>
-            <a:graphic xmlns:a="http://schemas.openxmlformats.org/drawingml/2006/main">
-              <a:graphicData uri="http://schemas.openxmlformats.org/drawingml/2006/picture">
-                <pic:pic xmlns:pic="http://schemas.openxmlformats.org/drawingml/2006/picture">
-                  <pic:nvPicPr>
-                    <pic:cNvPr id="1" name=""/>
-                    <pic:cNvPicPr/>
-                  </pic:nvPicPr>
-                  <pic:blipFill>
-                    <a:blip r:embed="rId7"/>
-                    <a:stretch>
-                      <a:fillRect/>
-                    </a:stretch>
-                  </pic:blipFill>
-                  <pic:spPr>
-                    <a:xfrm>
-                      <a:off x="0" y="0"/>
-                      <a:ext cx="5612130" cy="844550"/>
-                    </a:xfrm>
-                    <a:prstGeom prst="rect">
-                      <a:avLst/>
-                    </a:prstGeom>
-                  </pic:spPr>
-                </pic:pic>
-              </a:graphicData>
-            </a:graphic>
-          </wp:inline>
-        </w:drawing>
-      </w:r>
     </w:p>
     <w:p>
       <w:pPr>
@@ -428,104 +248,25 @@
           <w:lang w:val="es-AR"/>
         </w:rPr>
       </w:pPr>
-      <w:r>
-        <w:rPr>
-          <w:b/>
-          <w:bCs/>
-          <w:noProof/>
-          <w:sz w:val="24"/>
-          <w:szCs w:val="24"/>
-          <w:lang w:val="es-AR"/>
-        </w:rPr>
-        <w:drawing>
-          <wp:inline distT="0" distB="0" distL="0" distR="0" wp14:anchorId="0ABDAC67" wp14:editId="314061D6">
-            <wp:extent cx="5612130" cy="875030"/>
-            <wp:effectExtent l="0" t="0" r="7620" b="1270"/>
-            <wp:docPr id="7" name="Imagen 7"/>
-            <wp:cNvGraphicFramePr>
-              <a:graphicFrameLocks xmlns:a="http://schemas.openxmlformats.org/drawingml/2006/main" noChangeAspect="1"/>
-            </wp:cNvGraphicFramePr>
-            <a:graphic xmlns:a="http://schemas.openxmlformats.org/drawingml/2006/main">
-              <a:graphicData uri="http://schemas.openxmlformats.org/drawingml/2006/picture">
-                <pic:pic xmlns:pic="http://schemas.openxmlformats.org/drawingml/2006/picture">
-                  <pic:nvPicPr>
-                    <pic:cNvPr id="1" name=""/>
-                    <pic:cNvPicPr/>
-                  </pic:nvPicPr>
-                  <pic:blipFill>
-                    <a:blip r:embed="rId8"/>
-                    <a:stretch>
-                      <a:fillRect/>
-                    </a:stretch>
-                  </pic:blipFill>
-                  <pic:spPr>
-                    <a:xfrm>
-                      <a:off x="0" y="0"/>
-                      <a:ext cx="5612130" cy="875030"/>
-                    </a:xfrm>
-                    <a:prstGeom prst="rect">
-                      <a:avLst/>
-                    </a:prstGeom>
-                  </pic:spPr>
-                </pic:pic>
-              </a:graphicData>
-            </a:graphic>
-          </wp:inline>
-        </w:drawing>
-      </w:r>
-    </w:p>
-    <w:p>
-      <w:pPr>
-        <w:rPr>
-          <w:b/>
-          <w:bCs/>
-          <w:sz w:val="24"/>
-          <w:szCs w:val="24"/>
-          <w:lang w:val="es-AR"/>
-        </w:rPr>
-      </w:pPr>
-    </w:p>
-    <w:p>
-      <w:pPr>
-        <w:rPr>
-          <w:b/>
-          <w:bCs/>
-          <w:sz w:val="24"/>
-          <w:szCs w:val="24"/>
-          <w:lang w:val="es-AR"/>
-        </w:rPr>
-      </w:pPr>
-    </w:p>
-    <w:p>
-      <w:pPr>
-        <w:rPr>
-          <w:b/>
-          <w:bCs/>
-          <w:sz w:val="24"/>
-          <w:szCs w:val="24"/>
-          <w:lang w:val="es-AR"/>
-        </w:rPr>
-      </w:pPr>
-    </w:p>
-    <w:p>
-      <w:pPr>
-        <w:rPr>
-          <w:b/>
-          <w:bCs/>
-          <w:sz w:val="24"/>
-          <w:szCs w:val="24"/>
-          <w:lang w:val="es-AR"/>
-        </w:rPr>
-      </w:pPr>
-      <w:r>
-        <w:rPr>
-          <w:b/>
-          <w:bCs/>
-          <w:sz w:val="24"/>
-          <w:szCs w:val="24"/>
-          <w:lang w:val="es-AR"/>
-        </w:rPr>
-        <w:lastRenderedPageBreak/>
+    </w:p>
+    <w:p>
+      <w:pPr>
+        <w:rPr>
+          <w:b/>
+          <w:bCs/>
+          <w:sz w:val="24"/>
+          <w:szCs w:val="24"/>
+          <w:lang w:val="es-AR"/>
+        </w:rPr>
+      </w:pPr>
+      <w:r>
+        <w:rPr>
+          <w:b/>
+          <w:bCs/>
+          <w:sz w:val="24"/>
+          <w:szCs w:val="24"/>
+          <w:lang w:val="es-AR"/>
+        </w:rPr>
         <w:t xml:space="preserve">Alumno: </w:t>
       </w:r>
       <w:r>
@@ -549,51 +290,6 @@
           <w:lang w:val="es-AR"/>
         </w:rPr>
       </w:pPr>
-      <w:r>
-        <w:rPr>
-          <w:b/>
-          <w:bCs/>
-          <w:noProof/>
-          <w:sz w:val="24"/>
-          <w:szCs w:val="24"/>
-          <w:lang w:val="es-AR"/>
-        </w:rPr>
-        <w:drawing>
-          <wp:inline distT="0" distB="0" distL="0" distR="0" wp14:anchorId="6BB87EDD" wp14:editId="3B02E44D">
-            <wp:extent cx="5612130" cy="857885"/>
-            <wp:effectExtent l="0" t="0" r="7620" b="0"/>
-            <wp:docPr id="3" name="Imagen 3"/>
-            <wp:cNvGraphicFramePr>
-              <a:graphicFrameLocks xmlns:a="http://schemas.openxmlformats.org/drawingml/2006/main" noChangeAspect="1"/>
-            </wp:cNvGraphicFramePr>
-            <a:graphic xmlns:a="http://schemas.openxmlformats.org/drawingml/2006/main">
-              <a:graphicData uri="http://schemas.openxmlformats.org/drawingml/2006/picture">
-                <pic:pic xmlns:pic="http://schemas.openxmlformats.org/drawingml/2006/picture">
-                  <pic:nvPicPr>
-                    <pic:cNvPr id="1" name=""/>
-                    <pic:cNvPicPr/>
-                  </pic:nvPicPr>
-                  <pic:blipFill>
-                    <a:blip r:embed="rId9"/>
-                    <a:stretch>
-                      <a:fillRect/>
-                    </a:stretch>
-                  </pic:blipFill>
-                  <pic:spPr>
-                    <a:xfrm>
-                      <a:off x="0" y="0"/>
-                      <a:ext cx="5612130" cy="857885"/>
-                    </a:xfrm>
-                    <a:prstGeom prst="rect">
-                      <a:avLst/>
-                    </a:prstGeom>
-                  </pic:spPr>
-                </pic:pic>
-              </a:graphicData>
-            </a:graphic>
-          </wp:inline>
-        </w:drawing>
-      </w:r>
     </w:p>
     <w:p>
       <w:pPr>
@@ -648,51 +344,6 @@
           <w:lang w:val="es-AR"/>
         </w:rPr>
       </w:pPr>
-      <w:r>
-        <w:rPr>
-          <w:b/>
-          <w:bCs/>
-          <w:noProof/>
-          <w:sz w:val="24"/>
-          <w:szCs w:val="24"/>
-          <w:lang w:val="es-AR"/>
-        </w:rPr>
-        <w:drawing>
-          <wp:inline distT="0" distB="0" distL="0" distR="0" wp14:anchorId="353925CB" wp14:editId="1FF1A492">
-            <wp:extent cx="5612130" cy="828675"/>
-            <wp:effectExtent l="0" t="0" r="7620" b="9525"/>
-            <wp:docPr id="4" name="Imagen 4"/>
-            <wp:cNvGraphicFramePr>
-              <a:graphicFrameLocks xmlns:a="http://schemas.openxmlformats.org/drawingml/2006/main" noChangeAspect="1"/>
-            </wp:cNvGraphicFramePr>
-            <a:graphic xmlns:a="http://schemas.openxmlformats.org/drawingml/2006/main">
-              <a:graphicData uri="http://schemas.openxmlformats.org/drawingml/2006/picture">
-                <pic:pic xmlns:pic="http://schemas.openxmlformats.org/drawingml/2006/picture">
-                  <pic:nvPicPr>
-                    <pic:cNvPr id="1" name=""/>
-                    <pic:cNvPicPr/>
-                  </pic:nvPicPr>
-                  <pic:blipFill>
-                    <a:blip r:embed="rId10"/>
-                    <a:stretch>
-                      <a:fillRect/>
-                    </a:stretch>
-                  </pic:blipFill>
-                  <pic:spPr>
-                    <a:xfrm>
-                      <a:off x="0" y="0"/>
-                      <a:ext cx="5612130" cy="828675"/>
-                    </a:xfrm>
-                    <a:prstGeom prst="rect">
-                      <a:avLst/>
-                    </a:prstGeom>
-                  </pic:spPr>
-                </pic:pic>
-              </a:graphicData>
-            </a:graphic>
-          </wp:inline>
-        </w:drawing>
-      </w:r>
     </w:p>
     <w:p>
       <w:pPr>
@@ -735,51 +386,6 @@
           <w:lang w:val="es-AR"/>
         </w:rPr>
       </w:pPr>
-      <w:r>
-        <w:rPr>
-          <w:b/>
-          <w:bCs/>
-          <w:noProof/>
-          <w:sz w:val="24"/>
-          <w:szCs w:val="24"/>
-          <w:lang w:val="es-AR"/>
-        </w:rPr>
-        <w:drawing>
-          <wp:inline distT="0" distB="0" distL="0" distR="0" wp14:anchorId="419AC6A3" wp14:editId="062C9FDE">
-            <wp:extent cx="5612130" cy="1522095"/>
-            <wp:effectExtent l="0" t="0" r="7620" b="1905"/>
-            <wp:docPr id="5" name="Imagen 5"/>
-            <wp:cNvGraphicFramePr>
-              <a:graphicFrameLocks xmlns:a="http://schemas.openxmlformats.org/drawingml/2006/main" noChangeAspect="1"/>
-            </wp:cNvGraphicFramePr>
-            <a:graphic xmlns:a="http://schemas.openxmlformats.org/drawingml/2006/main">
-              <a:graphicData uri="http://schemas.openxmlformats.org/drawingml/2006/picture">
-                <pic:pic xmlns:pic="http://schemas.openxmlformats.org/drawingml/2006/picture">
-                  <pic:nvPicPr>
-                    <pic:cNvPr id="1" name=""/>
-                    <pic:cNvPicPr/>
-                  </pic:nvPicPr>
-                  <pic:blipFill>
-                    <a:blip r:embed="rId11"/>
-                    <a:stretch>
-                      <a:fillRect/>
-                    </a:stretch>
-                  </pic:blipFill>
-                  <pic:spPr>
-                    <a:xfrm>
-                      <a:off x="0" y="0"/>
-                      <a:ext cx="5612130" cy="1522095"/>
-                    </a:xfrm>
-                    <a:prstGeom prst="rect">
-                      <a:avLst/>
-                    </a:prstGeom>
-                  </pic:spPr>
-                </pic:pic>
-              </a:graphicData>
-            </a:graphic>
-          </wp:inline>
-        </w:drawing>
-      </w:r>
     </w:p>
     <w:sectPr>
       <w:pgSz w:w="12240" w:h="15840"/>

</xml_diff>

<commit_message>
agregue los Logs de caga rama
</commit_message>
<xml_diff>
--- a/Logs de cada Rama.docx
+++ b/Logs de cada Rama.docx
@@ -110,6 +110,50 @@
           <w:lang w:val="es-AR"/>
         </w:rPr>
       </w:pPr>
+      <w:r>
+        <w:rPr>
+          <w:b/>
+          <w:bCs/>
+          <w:sz w:val="40"/>
+          <w:szCs w:val="40"/>
+          <w:lang w:val="es-AR"/>
+        </w:rPr>
+        <w:drawing>
+          <wp:inline distT="0" distB="0" distL="0" distR="0" wp14:anchorId="2E7F66A3" wp14:editId="4D4687D7">
+            <wp:extent cx="5612130" cy="859155"/>
+            <wp:effectExtent l="0" t="0" r="7620" b="0"/>
+            <wp:docPr id="1" name="Imagen 1"/>
+            <wp:cNvGraphicFramePr>
+              <a:graphicFrameLocks xmlns:a="http://schemas.openxmlformats.org/drawingml/2006/main" noChangeAspect="1"/>
+            </wp:cNvGraphicFramePr>
+            <a:graphic xmlns:a="http://schemas.openxmlformats.org/drawingml/2006/main">
+              <a:graphicData uri="http://schemas.openxmlformats.org/drawingml/2006/picture">
+                <pic:pic xmlns:pic="http://schemas.openxmlformats.org/drawingml/2006/picture">
+                  <pic:nvPicPr>
+                    <pic:cNvPr id="1" name=""/>
+                    <pic:cNvPicPr/>
+                  </pic:nvPicPr>
+                  <pic:blipFill>
+                    <a:blip r:embed="rId4"/>
+                    <a:stretch>
+                      <a:fillRect/>
+                    </a:stretch>
+                  </pic:blipFill>
+                  <pic:spPr>
+                    <a:xfrm>
+                      <a:off x="0" y="0"/>
+                      <a:ext cx="5612130" cy="859155"/>
+                    </a:xfrm>
+                    <a:prstGeom prst="rect">
+                      <a:avLst/>
+                    </a:prstGeom>
+                  </pic:spPr>
+                </pic:pic>
+              </a:graphicData>
+            </a:graphic>
+          </wp:inline>
+        </w:drawing>
+      </w:r>
     </w:p>
     <w:p>
       <w:pPr>
@@ -164,6 +208,50 @@
           <w:lang w:val="es-AR"/>
         </w:rPr>
       </w:pPr>
+      <w:r>
+        <w:rPr>
+          <w:b/>
+          <w:bCs/>
+          <w:sz w:val="24"/>
+          <w:szCs w:val="24"/>
+          <w:lang w:val="es-AR"/>
+        </w:rPr>
+        <w:drawing>
+          <wp:inline distT="0" distB="0" distL="0" distR="0" wp14:anchorId="0382226A" wp14:editId="0693B1A5">
+            <wp:extent cx="5612130" cy="776605"/>
+            <wp:effectExtent l="0" t="0" r="7620" b="4445"/>
+            <wp:docPr id="9" name="Imagen 9"/>
+            <wp:cNvGraphicFramePr>
+              <a:graphicFrameLocks xmlns:a="http://schemas.openxmlformats.org/drawingml/2006/main" noChangeAspect="1"/>
+            </wp:cNvGraphicFramePr>
+            <a:graphic xmlns:a="http://schemas.openxmlformats.org/drawingml/2006/main">
+              <a:graphicData uri="http://schemas.openxmlformats.org/drawingml/2006/picture">
+                <pic:pic xmlns:pic="http://schemas.openxmlformats.org/drawingml/2006/picture">
+                  <pic:nvPicPr>
+                    <pic:cNvPr id="1" name=""/>
+                    <pic:cNvPicPr/>
+                  </pic:nvPicPr>
+                  <pic:blipFill>
+                    <a:blip r:embed="rId5"/>
+                    <a:stretch>
+                      <a:fillRect/>
+                    </a:stretch>
+                  </pic:blipFill>
+                  <pic:spPr>
+                    <a:xfrm>
+                      <a:off x="0" y="0"/>
+                      <a:ext cx="5612130" cy="776605"/>
+                    </a:xfrm>
+                    <a:prstGeom prst="rect">
+                      <a:avLst/>
+                    </a:prstGeom>
+                  </pic:spPr>
+                </pic:pic>
+              </a:graphicData>
+            </a:graphic>
+          </wp:inline>
+        </w:drawing>
+      </w:r>
     </w:p>
     <w:p>
       <w:pPr>
@@ -206,6 +294,50 @@
           <w:lang w:val="es-AR"/>
         </w:rPr>
       </w:pPr>
+      <w:r>
+        <w:rPr>
+          <w:b/>
+          <w:bCs/>
+          <w:sz w:val="24"/>
+          <w:szCs w:val="24"/>
+          <w:lang w:val="es-AR"/>
+        </w:rPr>
+        <w:drawing>
+          <wp:inline distT="0" distB="0" distL="0" distR="0" wp14:anchorId="36456B90" wp14:editId="3843314A">
+            <wp:extent cx="5612130" cy="778510"/>
+            <wp:effectExtent l="0" t="0" r="7620" b="2540"/>
+            <wp:docPr id="10" name="Imagen 10"/>
+            <wp:cNvGraphicFramePr>
+              <a:graphicFrameLocks xmlns:a="http://schemas.openxmlformats.org/drawingml/2006/main" noChangeAspect="1"/>
+            </wp:cNvGraphicFramePr>
+            <a:graphic xmlns:a="http://schemas.openxmlformats.org/drawingml/2006/main">
+              <a:graphicData uri="http://schemas.openxmlformats.org/drawingml/2006/picture">
+                <pic:pic xmlns:pic="http://schemas.openxmlformats.org/drawingml/2006/picture">
+                  <pic:nvPicPr>
+                    <pic:cNvPr id="1" name=""/>
+                    <pic:cNvPicPr/>
+                  </pic:nvPicPr>
+                  <pic:blipFill>
+                    <a:blip r:embed="rId6"/>
+                    <a:stretch>
+                      <a:fillRect/>
+                    </a:stretch>
+                  </pic:blipFill>
+                  <pic:spPr>
+                    <a:xfrm>
+                      <a:off x="0" y="0"/>
+                      <a:ext cx="5612130" cy="778510"/>
+                    </a:xfrm>
+                    <a:prstGeom prst="rect">
+                      <a:avLst/>
+                    </a:prstGeom>
+                  </pic:spPr>
+                </pic:pic>
+              </a:graphicData>
+            </a:graphic>
+          </wp:inline>
+        </w:drawing>
+      </w:r>
     </w:p>
     <w:p>
       <w:pPr>
@@ -248,6 +380,16 @@
           <w:lang w:val="es-AR"/>
         </w:rPr>
       </w:pPr>
+      <w:r>
+        <w:rPr>
+          <w:b/>
+          <w:bCs/>
+          <w:sz w:val="24"/>
+          <w:szCs w:val="24"/>
+          <w:lang w:val="es-AR"/>
+        </w:rPr>
+        <w:t>-</w:t>
+      </w:r>
     </w:p>
     <w:p>
       <w:pPr>
@@ -290,6 +432,50 @@
           <w:lang w:val="es-AR"/>
         </w:rPr>
       </w:pPr>
+      <w:r>
+        <w:rPr>
+          <w:b/>
+          <w:bCs/>
+          <w:sz w:val="24"/>
+          <w:szCs w:val="24"/>
+          <w:lang w:val="es-AR"/>
+        </w:rPr>
+        <w:drawing>
+          <wp:inline distT="0" distB="0" distL="0" distR="0" wp14:anchorId="4DC1C640" wp14:editId="6334B787">
+            <wp:extent cx="5612130" cy="793750"/>
+            <wp:effectExtent l="0" t="0" r="7620" b="6350"/>
+            <wp:docPr id="11" name="Imagen 11"/>
+            <wp:cNvGraphicFramePr>
+              <a:graphicFrameLocks xmlns:a="http://schemas.openxmlformats.org/drawingml/2006/main" noChangeAspect="1"/>
+            </wp:cNvGraphicFramePr>
+            <a:graphic xmlns:a="http://schemas.openxmlformats.org/drawingml/2006/main">
+              <a:graphicData uri="http://schemas.openxmlformats.org/drawingml/2006/picture">
+                <pic:pic xmlns:pic="http://schemas.openxmlformats.org/drawingml/2006/picture">
+                  <pic:nvPicPr>
+                    <pic:cNvPr id="1" name=""/>
+                    <pic:cNvPicPr/>
+                  </pic:nvPicPr>
+                  <pic:blipFill>
+                    <a:blip r:embed="rId7"/>
+                    <a:stretch>
+                      <a:fillRect/>
+                    </a:stretch>
+                  </pic:blipFill>
+                  <pic:spPr>
+                    <a:xfrm>
+                      <a:off x="0" y="0"/>
+                      <a:ext cx="5612130" cy="793750"/>
+                    </a:xfrm>
+                    <a:prstGeom prst="rect">
+                      <a:avLst/>
+                    </a:prstGeom>
+                  </pic:spPr>
+                </pic:pic>
+              </a:graphicData>
+            </a:graphic>
+          </wp:inline>
+        </w:drawing>
+      </w:r>
     </w:p>
     <w:p>
       <w:pPr>

</xml_diff>